<commit_message>
Update new 3 approaches and remove RDK board
</commit_message>
<xml_diff>
--- a/chapter_2_literature_review.docx
+++ b/chapter_2_literature_review.docx
@@ -77,17 +77,17 @@
       </w:r>
       <w:r>
         <w:rPr/>
-        <w:t xml:space="preserve"> by Shah et al. (2023a). LM-Nav is important because it presents a modular architecture for language-guided navigation. Its pipeline separates the problem into language understanding, visual grounding, and navigation execution. This structure is suitable for this FYP because the same idea can be adapted into a simpler prototype using an RDK X5 development board with 8GB RAM, a ROS Robot Control Board V3.0 with STM32F103RCT6 for motor control, an ESP32 for ultrasonic obstacle sensing, an unbranded USB webcam, four ultrasonic sensors, four DC motors, a mobile robot chassis, and 18650 batteries.</w:t>
-      </w:r>
-    </w:p>
-    <w:p>
-      <w:pPr>
-        <w:pStyle w:val="Normal"/>
-        <w:spacing w:after="160" w:line="360" w:lineRule="auto"/>
-      </w:pPr>
-      <w:r>
-        <w:rPr/>
-        <w:t xml:space="preserve">The project does not attempt to reproduce the complete hardware capability of LM-Nav or newer large-scale navigation systems. Instead, the project adapts the core research idea into a student-level implementation. A user may give instructions such as "Go to the door", "Find the signboard", or "Move toward the chair near the table". The system then uses prompt engineering to produce a structured navigation output, uses the webcam image for visual grounding or action selection, and sends a simple command such as </w:t>
+        <w:t xml:space="preserve"> by Shah et al. (2023a). LM-Nav is important because it presents a modular architecture for language-guided navigation. Its pipeline separates the problem into language understanding, visual grounding, and navigation execution. This structure is suitable for this FYP because the same idea can be adapted into three practical low-cost approaches: a Raspberry Pi robot with ESP32 motor and ultrasonic control plus remote GPU inference, a Google Dev Board robot with ESP32 motor and ultrasonic control, and a laptop-only feasibility setup using the laptop camera and local GPU before building the physical robot.</w:t>
+      </w:r>
+    </w:p>
+    <w:p>
+      <w:pPr>
+        <w:pStyle w:val="Normal"/>
+        <w:spacing w:after="160" w:line="360" w:lineRule="auto"/>
+      </w:pPr>
+      <w:r>
+        <w:rPr/>
+        <w:t xml:space="preserve">The project does not attempt to reproduce the complete hardware capability of LM-Nav or newer large-scale navigation systems. Instead, the project adapts the core research idea into a student-level implementation. A user may give instructions such as "Go to the door", "Find the signboard", or "Move toward the chair near the table". The system then uses prompt engineering to produce a structured navigation output, uses the webcam image for visual grounding or action selection, and outputs a simple command such as </w:t>
       </w:r>
       <w:r>
         <w:rPr>
@@ -137,7 +137,7 @@
       </w:r>
       <w:r>
         <w:rPr/>
-        <w:t xml:space="preserve"> to the robot.</w:t>
+        <w:t>. In the laptop-only phase, the command is displayed to the human operator; in the physical robot phase, it is validated and sent to the ESP32 motor-control layer.</w:t>
       </w:r>
     </w:p>
     <w:p>
@@ -399,7 +399,7 @@
       <w:r>
         <w:drawing>
           <wp:inline distT="0" distB="0" distL="0" distR="0">
-            <wp:extent cx="5733288" cy="1855161"/>
+            <wp:extent cx="5733288" cy="1752571"/>
             <wp:effectExtent l="0" t="0" r="0" b="0"/>
             <wp:docPr id="103" name="table_2_1_roles_of_prompt_engineering_in_mobile_robot_navigation"/>
             <wp:cNvGraphicFramePr/>
@@ -419,7 +419,7 @@
                   <pic:spPr>
                     <a:xfrm>
                       <a:off x="0" y="0"/>
-                      <a:ext cx="5733288" cy="1855161"/>
+                      <a:ext cx="5733288" cy="1752571"/>
                     </a:xfrm>
                     <a:prstGeom prst="rect">
                       <a:avLst/>
@@ -439,7 +439,7 @@
       </w:pPr>
       <w:r>
         <w:rPr/>
-        <w:t>For this project, prompt engineering is treated as the interface between human language and robot action. The prompt must not only produce a correct sentence; it must produce an output that can be checked, logged, evaluated, and used by the RDK X5 decision logic.</w:t>
+        <w:t>For this project, prompt engineering is treated as the interface between human language and robot action. The prompt must not only produce a correct sentence; it must produce an output that can be checked, logged, evaluated, and used by the decision logic on the laptop, Raspberry Pi, remote GPU server, or Google Dev Board.</w:t>
       </w:r>
     </w:p>
     <w:p>
@@ -769,7 +769,7 @@
       </w:pPr>
       <w:r>
         <w:rPr/>
-        <w:t>Another limitation is hardware and navigation complexity. LM-Nav was demonstrated with a more capable outdoor robot platform and a visual navigation model. A student FYP robot using an RDK X5 development board, STM32-based robot control board, ESP32 ultrasonic sensor module, USB webcam, and DC motors cannot reproduce the full navigation capability directly. Therefore, this project uses LM-Nav as an architectural inspiration, not as a full implementation target.</w:t>
+        <w:t>Another limitation is hardware and navigation complexity. LM-Nav was demonstrated with a more capable outdoor robot platform and a visual navigation model. A student FYP setup using a laptop camera, Raspberry Pi, Google Dev Board, ESP32 ultrasonic and motor control, USB webcam, and DC motors cannot reproduce the full navigation capability directly. Therefore, this project uses LM-Nav as an architectural inspiration, not as a full implementation target.</w:t>
       </w:r>
     </w:p>
     <w:p>
@@ -791,7 +791,7 @@
       </w:pPr>
       <w:r>
         <w:rPr/>
-        <w:t>LM-Nav provides the central structure for the proposed prototype: language understanding, visual grounding, and action execution. The difference is that this project adapts the final execution stage into a simple action-control system. Instead of using a full visual navigation policy, the RDK X5 board will select one of a small set of actions, check obstacle status from the ESP32 ultrasonic module, and send validated movement commands to the STM32-based robot control board. This makes the project realistic for a low-cost indoor robot while preserving the research value of structured prompt engineering.</w:t>
+        <w:t>LM-Nav provides the central structure for the proposed prototype: language understanding, visual grounding, and action execution. The difference is that this project adapts the final execution stage into a simple action-control system. Instead of using a full visual navigation policy, the selected compute setup will choose one of a small set of actions, check obstacle status from the ESP32 ultrasonic module in the physical robot approaches, and send validated commands to the ESP32 motor-control layer. In the laptop-only feasibility approach, the same action is displayed to a human operator instead of being sent to motors. This makes the project realistic for a low-cost indoor robot while preserving the research value of structured prompt engineering.</w:t>
       </w:r>
     </w:p>
     <w:p>
@@ -889,7 +889,7 @@
       </w:pPr>
       <w:r>
         <w:rPr/>
-        <w:t>The limitation is that direct VLM action selection may not be safe enough for unsupervised robot control. VLM outputs can be inconsistent, and the model may choose an action even when the target is not visible or the instruction is ambiguous. For this reason, the proposed FYP will validate the structured output, uncertainty level, and ESP32 ultrasonic obstacle status before sending commands to the STM32-based robot control board. VLMnav is therefore treated as a prompt/action-selection reference, while the robot remains a controlled research prototype.</w:t>
+        <w:t>The limitation is that direct VLM action selection may not be safe enough for unsupervised robot control. VLM outputs can be inconsistent, and the model may choose an action even when the target is not visible or the instruction is ambiguous. For this reason, the proposed FYP will validate the structured output, uncertainty level, model latency, and ESP32 ultrasonic obstacle status before physical motor execution. VLMnav is therefore treated as a prompt/action-selection reference, while the robot remains a controlled research prototype.</w:t>
       </w:r>
     </w:p>
     <w:p>
@@ -1077,7 +1077,7 @@
       </w:r>
       <w:r>
         <w:rPr/>
-        <w:t xml:space="preserve"> by Sridhar et al. (2023) uses a diffusion-based policy for goal-directed navigation and exploration. Its strength is stronger navigation behavior and exploration ability. Its limitation is that it requires a more complex policy deployment pipeline and suitable robot data. For the proposed project, NoMaD is therefore best treated as future work after the baseline RDK X5, ESP32, and STM32-controlled robot is functioning.</w:t>
+        <w:t xml:space="preserve"> by Sridhar et al. (2023) uses a diffusion-based policy for goal-directed navigation and exploration. Its strength is stronger navigation behavior and exploration ability. Its limitation is that it requires a more complex policy deployment pipeline and suitable robot data. For the proposed project, NoMaD is therefore best treated as future work after the baseline laptop feasibility test and ESP32-controlled physical robot pipeline are functioning.</w:t>
       </w:r>
     </w:p>
     <w:p>
@@ -1299,7 +1299,7 @@
       <w:r>
         <w:drawing>
           <wp:inline distT="0" distB="0" distL="0" distR="0">
-            <wp:extent cx="5733288" cy="1599130"/>
+            <wp:extent cx="5733288" cy="1661787"/>
             <wp:effectExtent l="0" t="0" r="0" b="0"/>
             <wp:docPr id="106" name="table_2_3_hardware_and_method_suitability_for_this_fyp"/>
             <wp:cNvGraphicFramePr/>
@@ -1319,7 +1319,7 @@
                   <pic:spPr>
                     <a:xfrm>
                       <a:off x="0" y="0"/>
-                      <a:ext cx="5733288" cy="1599130"/>
+                      <a:ext cx="5733288" cy="1661787"/>
                     </a:xfrm>
                     <a:prstGeom prst="rect">
                       <a:avLst/>
@@ -1373,7 +1373,7 @@
       <w:r>
         <w:drawing>
           <wp:inline distT="0" distB="0" distL="0" distR="0">
-            <wp:extent cx="5733288" cy="4007811"/>
+            <wp:extent cx="5733288" cy="4125457"/>
             <wp:effectExtent l="0" t="0" r="0" b="0"/>
             <wp:docPr id="107" name="figure_2_3_positioning_of_related_works_around_lm_nav"/>
             <wp:cNvGraphicFramePr/>
@@ -1393,7 +1393,7 @@
                   <pic:spPr>
                     <a:xfrm>
                       <a:off x="0" y="0"/>
-                      <a:ext cx="5733288" cy="4007811"/>
+                      <a:ext cx="5733288" cy="4125457"/>
                     </a:xfrm>
                     <a:prstGeom prst="rect">
                       <a:avLst/>
@@ -1435,7 +1435,7 @@
       </w:pPr>
       <w:r>
         <w:rPr/>
-        <w:t>First, existing systems can perform language-guided navigation, but many require expensive hardware, complex mapping, large models, or server-level compute. These systems are valuable research contributions, but they are not directly suitable for a student prototype using an RDK X5 board, STM32-based motor control board, ESP32 ultrasonic sensing, webcam input, and simple motor control.</w:t>
+        <w:t>First, existing systems can perform language-guided navigation, but many require expensive hardware, complex mapping, large models, or server-level compute. These systems are valuable research contributions, but they are not directly suitable for a student prototype that must begin with available hardware such as a laptop GPU, webcam, Raspberry Pi, Google Dev Board, ESP32, ultrasonic sensors, motor driver, and simple DC motors.</w:t>
       </w:r>
     </w:p>
     <w:p>
@@ -1465,7 +1465,7 @@
       </w:pPr>
       <w:r>
         <w:rPr/>
-        <w:t>Fourth, there is a need for a baseline prototype that future researchers can extend. A working RDK X5, ESP32, and STM32-controlled robot with webcam grounding, ultrasonic safety sensing, and simple actions provides a practical platform for later improvements such as RGB-D sensing, LiDAR, scene graph mapping, ViNT, NoMaD, or advanced VLM/VLA models.</w:t>
+        <w:t>Fourth, there is a need for a baseline prototype that future researchers can extend. A staged workflow beginning with laptop-only feasibility testing and continuing toward an ESP32-controlled physical robot with webcam grounding, ultrasonic safety sensing, and simple actions provides a practical platform for later improvements such as RGB-D sensing, LiDAR, scene graph mapping, ViNT, NoMaD, or advanced VLM/VLA models.</w:t>
       </w:r>
     </w:p>
     <w:p>
@@ -1581,7 +1581,7 @@
       </w:pPr>
       <w:r>
         <w:rPr/>
-        <w:t>The research gap is that there is a need for a low-cost indoor prototype that studies structured prompt engineering for simple mobile robot navigation. Chapter 3 explains how this project addresses the gap through a proposed RDK X5, ROS Robot Control Board V3.0 with STM32F103RCT6, ESP32 ultrasonic sensing module, USB webcam, and four-motor mobile robot system.</w:t>
+        <w:t>The research gap is that there is a need for a low-cost indoor prototype that studies structured prompt engineering for simple mobile robot navigation. Chapter 3 explains how this project addresses the gap through three updated approaches: laptop-only feasibility testing, Raspberry Pi with remote GPU inference and ESP32 motor/sensor control, and Google Dev Board with ESP32 motor/sensor control.</w:t>
       </w:r>
     </w:p>
     <w:p>

</xml_diff>

<commit_message>
Using one approach and docker
</commit_message>
<xml_diff>
--- a/chapter_2_literature_review.docx
+++ b/chapter_2_literature_review.docx
@@ -77,17 +77,17 @@
       </w:r>
       <w:r>
         <w:rPr/>
-        <w:t xml:space="preserve"> by Shah et al. (2023a). LM-Nav is important because it presents a modular architecture for language-guided navigation. Its pipeline separates the problem into language understanding, visual grounding, and navigation execution. This structure is suitable for this FYP because the same idea can be adapted into three practical low-cost approaches: a Raspberry Pi robot with ESP32 motor and ultrasonic control plus remote GPU inference, a Google Dev Board robot with ESP32 motor and ultrasonic control, and a laptop-only feasibility setup using the laptop camera and local GPU before building the physical robot.</w:t>
-      </w:r>
-    </w:p>
-    <w:p>
-      <w:pPr>
-        <w:pStyle w:val="Normal"/>
-        <w:spacing w:after="160" w:line="360" w:lineRule="auto"/>
-      </w:pPr>
-      <w:r>
-        <w:rPr/>
-        <w:t xml:space="preserve">The project does not attempt to reproduce the complete hardware capability of LM-Nav or newer large-scale navigation systems. Instead, the project adapts the core research idea into a student-level implementation. A user may give instructions such as "Go to the door", "Find the signboard", or "Move toward the chair near the table". The system then uses prompt engineering to produce a structured navigation output, uses the webcam image for visual grounding or action selection, and outputs a simple command such as </w:t>
+        <w:t xml:space="preserve"> by Shah et al. (2023a). LM-Nav is important because it presents a modular architecture for language-guided navigation. Its pipeline separates the problem into language understanding, visual grounding, and navigation execution. This structure is suitable for this FYP because the same idea can be adapted into one focused low-cost Coral Dev Board robot with ESP32 low-level control.</w:t>
+      </w:r>
+    </w:p>
+    <w:p>
+      <w:pPr>
+        <w:pStyle w:val="Normal"/>
+        <w:spacing w:after="160" w:line="360" w:lineRule="auto"/>
+      </w:pPr>
+      <w:r>
+        <w:rPr/>
+        <w:t xml:space="preserve">The project does not attempt to reproduce the complete hardware capability of LM-Nav or newer large-scale navigation systems. Instead, the project adapts the core research idea into a student-level Coral Dev Board physical robot. The first prototype uses a basic instruction such as "Find the chair". The Coral Dev Board produces structured navigation information, uses the USB-webcam image and an Edge TPU-compatible detector for visual grounding, validates the proposed action using ESP32 sensor status, and sends a simple command such as </w:t>
       </w:r>
       <w:r>
         <w:rPr>
@@ -137,7 +137,7 @@
       </w:r>
       <w:r>
         <w:rPr/>
-        <w:t>. In the laptop-only phase, the command is displayed to the human operator; in the physical robot phase, it is validated and sent to the ESP32 motor-control layer.</w:t>
+        <w:t xml:space="preserve"> to the ESP32 motor-control layer.</w:t>
       </w:r>
     </w:p>
     <w:p>
@@ -315,7 +315,7 @@
                     <pic:cNvPicPr/>
                   </pic:nvPicPr>
                   <pic:blipFill>
-                    <a:blip r:embed="rId1"/>
+                    <a:blip r:embed="rId2"/>
                     <a:stretch>
                       <a:fillRect/>
                     </a:stretch>
@@ -393,53 +393,12 @@
     </w:p>
     <w:p>
       <w:pPr>
-        <w:jc w:val="center"/>
-        <w:spacing w:after="220"/>
-      </w:pPr>
-      <w:r>
-        <w:drawing>
-          <wp:inline distT="0" distB="0" distL="0" distR="0">
-            <wp:extent cx="5733288" cy="1752571"/>
-            <wp:effectExtent l="0" t="0" r="0" b="0"/>
-            <wp:docPr id="103" name="table_2_1_roles_of_prompt_engineering_in_mobile_robot_navigation"/>
-            <wp:cNvGraphicFramePr/>
-            <a:graphic>
-              <a:graphicData uri="http://schemas.openxmlformats.org/drawingml/2006/picture">
-                <pic:pic>
-                  <pic:nvPicPr>
-                    <pic:cNvPr id="0" name="image2.png"/>
-                    <pic:cNvPicPr/>
-                  </pic:nvPicPr>
-                  <pic:blipFill>
-                    <a:blip r:embed="rId2"/>
-                    <a:stretch>
-                      <a:fillRect/>
-                    </a:stretch>
-                  </pic:blipFill>
-                  <pic:spPr>
-                    <a:xfrm>
-                      <a:off x="0" y="0"/>
-                      <a:ext cx="5733288" cy="1752571"/>
-                    </a:xfrm>
-                    <a:prstGeom prst="rect">
-                      <a:avLst/>
-                    </a:prstGeom>
-                  </pic:spPr>
-                </pic:pic>
-              </a:graphicData>
-            </a:graphic>
-          </wp:inline>
-        </w:drawing>
-      </w:r>
-    </w:p>
-    <w:p>
-      <w:pPr>
-        <w:pStyle w:val="Normal"/>
-        <w:spacing w:after="160" w:line="360" w:lineRule="auto"/>
-      </w:pPr>
-      <w:r>
-        <w:rPr/>
-        <w:t>For this project, prompt engineering is treated as the interface between human language and robot action. The prompt must not only produce a correct sentence; it must produce an output that can be checked, logged, evaluated, and used by the decision logic on the laptop, Raspberry Pi, remote GPU server, or Google Dev Board.</w:t>
+        <w:pStyle w:val="Normal"/>
+        <w:spacing w:after="160" w:line="360" w:lineRule="auto"/>
+      </w:pPr>
+      <w:r>
+        <w:rPr/>
+        <w:t>For this project, prompt engineering is treated as the interface between human language and robot action. The prompt must not only produce a correct sentence; it must produce an output that can be checked, logged, evaluated, and used by the onboard Coral Dev Board decision logic.</w:t>
       </w:r>
     </w:p>
     <w:p>
@@ -587,7 +546,8 @@
     <w:p>
       <w:pPr>
         <w:pStyle w:val="Normal"/>
-        <w:spacing w:after="160" w:line="360" w:lineRule="auto"/>
+        <w:ind w:left="360"/>
+        <w:spacing w:after="80" w:line="360" w:lineRule="auto"/>
       </w:pPr>
       <w:r>
         <w:rPr/>
@@ -597,7 +557,8 @@
     <w:p>
       <w:pPr>
         <w:pStyle w:val="Normal"/>
-        <w:spacing w:after="160" w:line="360" w:lineRule="auto"/>
+        <w:ind w:left="360"/>
+        <w:spacing w:after="80" w:line="360" w:lineRule="auto"/>
       </w:pPr>
       <w:r>
         <w:rPr/>
@@ -607,7 +568,8 @@
     <w:p>
       <w:pPr>
         <w:pStyle w:val="Normal"/>
-        <w:spacing w:after="160" w:line="360" w:lineRule="auto"/>
+        <w:ind w:left="360"/>
+        <w:spacing w:after="80" w:line="360" w:lineRule="auto"/>
       </w:pPr>
       <w:r>
         <w:rPr/>
@@ -647,13 +609,13 @@
           <wp:inline distT="0" distB="0" distL="0" distR="0">
             <wp:extent cx="5733288" cy="7798504"/>
             <wp:effectExtent l="0" t="0" r="0" b="0"/>
-            <wp:docPr id="104" name="figure_2_2_lm_nav_baseline_pipeline"/>
+            <wp:docPr id="103" name="figure_2_2_lm_nav_baseline_pipeline"/>
             <wp:cNvGraphicFramePr/>
             <a:graphic>
               <a:graphicData uri="http://schemas.openxmlformats.org/drawingml/2006/picture">
                 <pic:pic>
                   <pic:nvPicPr>
-                    <pic:cNvPr id="0" name="image3.png"/>
+                    <pic:cNvPr id="0" name="image2.png"/>
                     <pic:cNvPicPr/>
                   </pic:nvPicPr>
                   <pic:blipFill>
@@ -769,7 +731,7 @@
       </w:pPr>
       <w:r>
         <w:rPr/>
-        <w:t>Another limitation is hardware and navigation complexity. LM-Nav was demonstrated with a more capable outdoor robot platform and a visual navigation model. A student FYP setup using a laptop camera, Raspberry Pi, Google Dev Board, ESP32 ultrasonic and motor control, USB webcam, and DC motors cannot reproduce the full navigation capability directly. Therefore, this project uses LM-Nav as an architectural inspiration, not as a full implementation target.</w:t>
+        <w:t>Another limitation is hardware and navigation complexity. LM-Nav was demonstrated with a more capable outdoor robot platform and a visual navigation model. A student FYP setup using a Coral Dev Board, ESP32 sensor and motor control, USB webcam, two ultrasonic sensors, and four DC motors cannot reproduce the full navigation capability directly. Therefore, this project uses LM-Nav as an architectural inspiration, not as a full implementation target.</w:t>
       </w:r>
     </w:p>
     <w:p>
@@ -791,7 +753,7 @@
       </w:pPr>
       <w:r>
         <w:rPr/>
-        <w:t>LM-Nav provides the central structure for the proposed prototype: language understanding, visual grounding, and action execution. The difference is that this project adapts the final execution stage into a simple action-control system. Instead of using a full visual navigation policy, the selected compute setup will choose one of a small set of actions, check obstacle status from the ESP32 ultrasonic module in the physical robot approaches, and send validated commands to the ESP32 motor-control layer. In the laptop-only feasibility approach, the same action is displayed to a human operator instead of being sent to motors. This makes the project realistic for a low-cost indoor robot while preserving the research value of structured prompt engineering.</w:t>
+        <w:t>LM-Nav provides the central structure for the proposed prototype: language understanding, visual grounding, and action execution. The difference is that this project adapts the final execution stage into a simple action-control system. Instead of using a full visual navigation policy, the Coral Dev Board chooses one of a small set of actions, checks obstacle status from the ESP32 ultrasonic module, and sends validated commands to the ESP32 motor-control layer. This makes the project realistic for a low-cost indoor robot while preserving the research value of structured prompt engineering.</w:t>
       </w:r>
     </w:p>
     <w:p>
@@ -1077,7 +1039,7 @@
       </w:r>
       <w:r>
         <w:rPr/>
-        <w:t xml:space="preserve"> by Sridhar et al. (2023) uses a diffusion-based policy for goal-directed navigation and exploration. Its strength is stronger navigation behavior and exploration ability. Its limitation is that it requires a more complex policy deployment pipeline and suitable robot data. For the proposed project, NoMaD is therefore best treated as future work after the baseline laptop feasibility test and ESP32-controlled physical robot pipeline are functioning.</w:t>
+        <w:t xml:space="preserve"> by Sridhar et al. (2023) uses a diffusion-based policy for goal-directed navigation and exploration. Its strength is stronger navigation behavior and exploration ability. Its limitation is that it requires a more complex policy deployment pipeline and suitable robot data. For the proposed project, NoMaD is therefore best treated as future work after the basic Coral Dev Board physical robot pipeline is functioning.</w:t>
       </w:r>
     </w:p>
     <w:p>
@@ -1207,185 +1169,103 @@
     </w:p>
     <w:p>
       <w:pPr>
+        <w:pStyle w:val="Normal"/>
+        <w:spacing w:after="160" w:line="360" w:lineRule="auto"/>
+      </w:pPr>
+      <w:r>
+        <w:rPr/>
+        <w:t>The comparison shows that LM-Nav and VLMnav are the most directly relevant to this project. LM-Nav provides the modular structure, while VLMnav supports the idea of selecting actions through prompt-based reasoning. VLMaps, HOV-SG, ViNT, NoMaD, NaVid, Uni-NaVid, and NaVILA are important, but they require additional sensing, mapping, model deployment, or compute resources that are not realistic for the first prototype.</w:t>
+      </w:r>
+    </w:p>
+    <w:p>
+      <w:pPr>
+        <w:pStyle w:val="Heading1"/>
+        <w:spacing w:after="180" w:line="360" w:lineRule="auto"/>
+      </w:pPr>
+      <w:r>
+        <w:rPr>
+          <w:b/>
+        </w:rPr>
+        <w:t>2.11 Hardware Suitability for This FYP</w:t>
+      </w:r>
+    </w:p>
+    <w:p>
+      <w:pPr>
+        <w:pStyle w:val="Normal"/>
+        <w:spacing w:after="160" w:line="360" w:lineRule="auto"/>
+      </w:pPr>
+      <w:r>
+        <w:rPr/>
+        <w:t>A critical issue for this project is hardware feasibility. Many research systems use expensive robots, RGB-D cameras, LiDAR, server GPUs, or advanced navigation policies. This FYP must use a lower-cost platform while still preserving a meaningful research contribution. Table 2.3 summarizes the suitability of literature components for the proposed implementation.</w:t>
+      </w:r>
+    </w:p>
+    <w:p>
+      <w:pPr>
+        <w:pStyle w:val="Caption"/>
+        <w:jc w:val="center"/>
+        <w:spacing w:after="120" w:line="360" w:lineRule="auto"/>
+      </w:pPr>
+      <w:r>
+        <w:rPr>
+          <w:b/>
+        </w:rPr>
+        <w:t>Table 2.3: Hardware and method suitability for this FYP</w:t>
+      </w:r>
+    </w:p>
+    <w:p>
+      <w:pPr>
+        <w:pStyle w:val="Normal"/>
+        <w:spacing w:after="160" w:line="360" w:lineRule="auto"/>
+      </w:pPr>
+      <w:r>
+        <w:rPr/>
+        <w:t>This table supports the design decision to build a low-cost indoor prototype. The project will not claim full autonomy in complex environments. Instead, it will demonstrate a baseline pipeline that future researchers can improve with better sensors, mapping, and navigation policies.</w:t>
+      </w:r>
+    </w:p>
+    <w:p>
+      <w:pPr>
+        <w:pStyle w:val="Normal"/>
+        <w:spacing w:after="160" w:line="360" w:lineRule="auto"/>
+      </w:pPr>
+      <w:r>
+        <w:rPr/>
+        <w:t>The positioning of the reviewed papers around the proposed baseline is shown in Figure 2.3.</w:t>
+      </w:r>
+    </w:p>
+    <w:p>
+      <w:pPr>
+        <w:pStyle w:val="Caption"/>
+        <w:jc w:val="center"/>
+        <w:spacing w:after="120" w:line="360" w:lineRule="auto"/>
+      </w:pPr>
+      <w:r>
+        <w:rPr>
+          <w:b/>
+        </w:rPr>
+        <w:t>Figure 2.3: Positioning of related works around LM-Nav</w:t>
+      </w:r>
+    </w:p>
+    <w:p>
+      <w:pPr>
         <w:jc w:val="center"/>
         <w:spacing w:after="220"/>
       </w:pPr>
       <w:r>
         <w:drawing>
           <wp:inline distT="0" distB="0" distL="0" distR="0">
-            <wp:extent cx="5733288" cy="909252"/>
+            <wp:extent cx="5733288" cy="4125457"/>
             <wp:effectExtent l="0" t="0" r="0" b="0"/>
-            <wp:docPr id="105" name="table_2_2_critical_comparison_of_related_papers"/>
+            <wp:docPr id="104" name="figure_2_3_positioning_of_related_works_around_lm_nav"/>
             <wp:cNvGraphicFramePr/>
             <a:graphic>
               <a:graphicData uri="http://schemas.openxmlformats.org/drawingml/2006/picture">
                 <pic:pic>
                   <pic:nvPicPr>
-                    <pic:cNvPr id="0" name="image4.png"/>
+                    <pic:cNvPr id="0" name="image3.png"/>
                     <pic:cNvPicPr/>
                   </pic:nvPicPr>
                   <pic:blipFill>
                     <a:blip r:embed="rId4"/>
-                    <a:stretch>
-                      <a:fillRect/>
-                    </a:stretch>
-                  </pic:blipFill>
-                  <pic:spPr>
-                    <a:xfrm>
-                      <a:off x="0" y="0"/>
-                      <a:ext cx="5733288" cy="909252"/>
-                    </a:xfrm>
-                    <a:prstGeom prst="rect">
-                      <a:avLst/>
-                    </a:prstGeom>
-                  </pic:spPr>
-                </pic:pic>
-              </a:graphicData>
-            </a:graphic>
-          </wp:inline>
-        </w:drawing>
-      </w:r>
-    </w:p>
-    <w:p>
-      <w:pPr>
-        <w:pStyle w:val="Normal"/>
-        <w:spacing w:after="160" w:line="360" w:lineRule="auto"/>
-      </w:pPr>
-      <w:r>
-        <w:rPr/>
-        <w:t>The comparison shows that LM-Nav and VLMnav are the most directly relevant to this project. LM-Nav provides the modular structure, while VLMnav supports the idea of selecting actions through prompt-based reasoning. VLMaps, HOV-SG, ViNT, NoMaD, NaVid, Uni-NaVid, and NaVILA are important, but they require additional sensing, mapping, model deployment, or compute resources that are not realistic for the first prototype.</w:t>
-      </w:r>
-    </w:p>
-    <w:p>
-      <w:pPr>
-        <w:pStyle w:val="Heading1"/>
-        <w:spacing w:after="180" w:line="360" w:lineRule="auto"/>
-      </w:pPr>
-      <w:r>
-        <w:rPr>
-          <w:b/>
-        </w:rPr>
-        <w:t>2.11 Hardware Suitability for This FYP</w:t>
-      </w:r>
-    </w:p>
-    <w:p>
-      <w:pPr>
-        <w:pStyle w:val="Normal"/>
-        <w:spacing w:after="160" w:line="360" w:lineRule="auto"/>
-      </w:pPr>
-      <w:r>
-        <w:rPr/>
-        <w:t>A critical issue for this project is hardware feasibility. Many research systems use expensive robots, RGB-D cameras, LiDAR, server GPUs, or advanced navigation policies. This FYP must use a lower-cost platform while still preserving a meaningful research contribution. Table 2.3 summarizes the suitability of literature components for the proposed implementation.</w:t>
-      </w:r>
-    </w:p>
-    <w:p>
-      <w:pPr>
-        <w:pStyle w:val="Caption"/>
-        <w:jc w:val="center"/>
-        <w:spacing w:after="120" w:line="360" w:lineRule="auto"/>
-      </w:pPr>
-      <w:r>
-        <w:rPr>
-          <w:b/>
-        </w:rPr>
-        <w:t>Table 2.3: Hardware and method suitability for this FYP</w:t>
-      </w:r>
-    </w:p>
-    <w:p>
-      <w:pPr>
-        <w:jc w:val="center"/>
-        <w:spacing w:after="220"/>
-      </w:pPr>
-      <w:r>
-        <w:drawing>
-          <wp:inline distT="0" distB="0" distL="0" distR="0">
-            <wp:extent cx="5733288" cy="1661787"/>
-            <wp:effectExtent l="0" t="0" r="0" b="0"/>
-            <wp:docPr id="106" name="table_2_3_hardware_and_method_suitability_for_this_fyp"/>
-            <wp:cNvGraphicFramePr/>
-            <a:graphic>
-              <a:graphicData uri="http://schemas.openxmlformats.org/drawingml/2006/picture">
-                <pic:pic>
-                  <pic:nvPicPr>
-                    <pic:cNvPr id="0" name="image5.png"/>
-                    <pic:cNvPicPr/>
-                  </pic:nvPicPr>
-                  <pic:blipFill>
-                    <a:blip r:embed="rId5"/>
-                    <a:stretch>
-                      <a:fillRect/>
-                    </a:stretch>
-                  </pic:blipFill>
-                  <pic:spPr>
-                    <a:xfrm>
-                      <a:off x="0" y="0"/>
-                      <a:ext cx="5733288" cy="1661787"/>
-                    </a:xfrm>
-                    <a:prstGeom prst="rect">
-                      <a:avLst/>
-                    </a:prstGeom>
-                  </pic:spPr>
-                </pic:pic>
-              </a:graphicData>
-            </a:graphic>
-          </wp:inline>
-        </w:drawing>
-      </w:r>
-    </w:p>
-    <w:p>
-      <w:pPr>
-        <w:pStyle w:val="Normal"/>
-        <w:spacing w:after="160" w:line="360" w:lineRule="auto"/>
-      </w:pPr>
-      <w:r>
-        <w:rPr/>
-        <w:t>This table supports the design decision to build a low-cost indoor prototype. The project will not claim full autonomy in complex environments. Instead, it will demonstrate a baseline pipeline that future researchers can improve with better sensors, mapping, and navigation policies.</w:t>
-      </w:r>
-    </w:p>
-    <w:p>
-      <w:pPr>
-        <w:pStyle w:val="Normal"/>
-        <w:spacing w:after="160" w:line="360" w:lineRule="auto"/>
-      </w:pPr>
-      <w:r>
-        <w:rPr/>
-        <w:t>The positioning of the reviewed papers around the proposed baseline is shown in Figure 2.3.</w:t>
-      </w:r>
-    </w:p>
-    <w:p>
-      <w:pPr>
-        <w:pStyle w:val="Caption"/>
-        <w:jc w:val="center"/>
-        <w:spacing w:after="120" w:line="360" w:lineRule="auto"/>
-      </w:pPr>
-      <w:r>
-        <w:rPr>
-          <w:b/>
-        </w:rPr>
-        <w:t>Figure 2.3: Positioning of related works around LM-Nav</w:t>
-      </w:r>
-    </w:p>
-    <w:p>
-      <w:pPr>
-        <w:jc w:val="center"/>
-        <w:spacing w:after="220"/>
-      </w:pPr>
-      <w:r>
-        <w:drawing>
-          <wp:inline distT="0" distB="0" distL="0" distR="0">
-            <wp:extent cx="5733288" cy="4125457"/>
-            <wp:effectExtent l="0" t="0" r="0" b="0"/>
-            <wp:docPr id="107" name="figure_2_3_positioning_of_related_works_around_lm_nav"/>
-            <wp:cNvGraphicFramePr/>
-            <a:graphic>
-              <a:graphicData uri="http://schemas.openxmlformats.org/drawingml/2006/picture">
-                <pic:pic>
-                  <pic:nvPicPr>
-                    <pic:cNvPr id="0" name="image6.png"/>
-                    <pic:cNvPicPr/>
-                  </pic:nvPicPr>
-                  <pic:blipFill>
-                    <a:blip r:embed="rId6"/>
                     <a:stretch>
                       <a:fillRect/>
                     </a:stretch>
@@ -1435,7 +1315,7 @@
       </w:pPr>
       <w:r>
         <w:rPr/>
-        <w:t>First, existing systems can perform language-guided navigation, but many require expensive hardware, complex mapping, large models, or server-level compute. These systems are valuable research contributions, but they are not directly suitable for a student prototype that must begin with available hardware such as a laptop GPU, webcam, Raspberry Pi, Google Dev Board, ESP32, ultrasonic sensors, motor driver, and simple DC motors.</w:t>
+        <w:t>First, existing systems can perform language-guided navigation, but many require expensive hardware, complex mapping, large models, or server-level compute. These systems are valuable research contributions, but they are not directly suitable for a student prototype using a Coral Dev Board, ESP32, USB webcam, two ultrasonic sensors, two MX1508 motor drivers, GY-291 accelerometer, and four DC gear motors.</w:t>
       </w:r>
     </w:p>
     <w:p>
@@ -1465,7 +1345,7 @@
       </w:pPr>
       <w:r>
         <w:rPr/>
-        <w:t>Fourth, there is a need for a baseline prototype that future researchers can extend. A staged workflow beginning with laptop-only feasibility testing and continuing toward an ESP32-controlled physical robot with webcam grounding, ultrasonic safety sensing, and simple actions provides a practical platform for later improvements such as RGB-D sensing, LiDAR, scene graph mapping, ViNT, NoMaD, or advanced VLM/VLA models.</w:t>
+        <w:t>Fourth, there is a need for a focused baseline physical prototype that future researchers can extend. A Coral Dev Board robot with webcam grounding, ESP32 safety control, acceleration and tilt feedback, and simple actions provides a practical platform for later improvements such as RGB-D sensing, LiDAR, scene graph mapping, ViNT, NoMaD, or advanced VLM/VLA models.</w:t>
       </w:r>
     </w:p>
     <w:p>
@@ -1483,47 +1363,6 @@
     </w:p>
     <w:p>
       <w:pPr>
-        <w:jc w:val="center"/>
-        <w:spacing w:after="220"/>
-      </w:pPr>
-      <w:r>
-        <w:drawing>
-          <wp:inline distT="0" distB="0" distL="0" distR="0">
-            <wp:extent cx="5733288" cy="1267358"/>
-            <wp:effectExtent l="0" t="0" r="0" b="0"/>
-            <wp:docPr id="108" name="table_2_4_research_gap_synthesis_and_project_strategy"/>
-            <wp:cNvGraphicFramePr/>
-            <a:graphic>
-              <a:graphicData uri="http://schemas.openxmlformats.org/drawingml/2006/picture">
-                <pic:pic>
-                  <pic:nvPicPr>
-                    <pic:cNvPr id="0" name="image7.png"/>
-                    <pic:cNvPicPr/>
-                  </pic:nvPicPr>
-                  <pic:blipFill>
-                    <a:blip r:embed="rId7"/>
-                    <a:stretch>
-                      <a:fillRect/>
-                    </a:stretch>
-                  </pic:blipFill>
-                  <pic:spPr>
-                    <a:xfrm>
-                      <a:off x="0" y="0"/>
-                      <a:ext cx="5733288" cy="1267358"/>
-                    </a:xfrm>
-                    <a:prstGeom prst="rect">
-                      <a:avLst/>
-                    </a:prstGeom>
-                  </pic:spPr>
-                </pic:pic>
-              </a:graphicData>
-            </a:graphic>
-          </wp:inline>
-        </w:drawing>
-      </w:r>
-    </w:p>
-    <w:p>
-      <w:pPr>
         <w:pStyle w:val="Normal"/>
         <w:spacing w:after="160" w:line="360" w:lineRule="auto"/>
       </w:pPr>
@@ -1581,7 +1420,7 @@
       </w:pPr>
       <w:r>
         <w:rPr/>
-        <w:t>The research gap is that there is a need for a low-cost indoor prototype that studies structured prompt engineering for simple mobile robot navigation. Chapter 3 explains how this project addresses the gap through three updated approaches: laptop-only feasibility testing, Raspberry Pi with remote GPU inference and ESP32 motor/sensor control, and Google Dev Board with ESP32 motor/sensor control.</w:t>
+        <w:t>The research gap is that there is a need for a low-cost indoor physical prototype that studies structured prompt engineering for simple mobile robot navigation. Chapter 3 explains how this project addresses the gap using one Coral Dev Board implementation with an ESP32 motor, sensor, and safety layer.</w:t>
       </w:r>
     </w:p>
     <w:p>
@@ -1687,11 +1526,38 @@
       </w:r>
     </w:p>
     <w:sectPr>
+      <w:footerReference w:type="default" r:id="rId1"/>
+      <w:pgNumType w:start="1"/>
       <w:pgSz w:w="11906" w:h="16838"/>
       <w:pgMar w:top="1440" w:right="1440" w:bottom="1440" w:left="1440" w:header="720" w:footer="720" w:gutter="0"/>
     </w:sectPr>
   </w:body>
 </w:document>
+</file>
+
+<file path=word/footer1.xml><?xml version="1.0" encoding="utf-8"?>
+<w:ftr xmlns:w="http://schemas.openxmlformats.org/wordprocessingml/2006/main">
+  <w:p>
+    <w:pPr>
+      <w:jc w:val="center"/>
+    </w:pPr>
+    <w:r>
+      <w:fldChar w:fldCharType="begin"/>
+    </w:r>
+    <w:r>
+      <w:instrText xml:space="preserve"> PAGE </w:instrText>
+    </w:r>
+    <w:r>
+      <w:fldChar w:fldCharType="separate"/>
+    </w:r>
+    <w:r>
+      <w:t>1</w:t>
+    </w:r>
+    <w:r>
+      <w:fldChar w:fldCharType="end"/>
+    </w:r>
+  </w:p>
+</w:ftr>
 </file>
 
 <file path=word/styles.xml><?xml version="1.0" encoding="utf-8"?>

</xml_diff>